<commit_message>
docs: circuit diagram for the ESP-12E edge node (LCD, buzzer, LEDs)
- documentation/make_circuit_diagram.py renders fig11_circuit.png: wiring from
  config.example.py (LCD I2C D2/D1 @0x27, buzzer D5, LEDs D6/D7, FLASH GPIO0)
- report: new 'Circuit view' subsection with the diagram + renumbered figures 1-11
- project document: diagram added as Figure 3 in S3.4, figures renumbered 1-6;
  S3.4 alarm text corrected (safe_fallback buzzes D5 for 1.2s, then reverts)
- BOM resistor value fixed 330->220 ohm to match the actual wiring
- ESP_INTEGRATION.md embeds the diagram above the pin table
</commit_message>
<xml_diff>
--- a/documentation/SignGuard_AI_Project_Document.docx
+++ b/documentation/SignGuard_AI_Project_Document.docx
@@ -835,7 +835,61 @@
           <w:i w:val="0"/>
           <w:sz w:val="22"/>
         </w:rPr>
-        <w:t>A verdict that stays in a database is only an opinion. The decision is therefore published as an MQTT command, and the ESP-12E node maps the three command values onto the physical display: render shows the authorised text with the green LED lit, safe fallback replaces it with a guarded message and lights the red LED, and isolate additionally sounds the buzzer for 1.2 seconds and shows that updates are blocked. The node keeps showing the last state it received, which is precisely the property that matters when the management network drops during an incident. On the operator side the board watcher mirrors this in software: when a serial device disappears it clears its cached device state, so a later insertion is judged on fresh evidence rather than on a stale allow-list entry.</w:t>
+        <w:t>A verdict that stays in a database is only an opinion. The decision is therefore published as an MQTT command, and the ESP-12E node maps the three command values onto the physical display: render shows the authorised text with the green LED lit, safe fallback replaces it with a guarded message, blinks the red LED and sounds the buzzer for 1.2 seconds before the sign reverts to the last verified content, and isolate lights the red LED solidly with a repeating beep while showing that updates are blocked. The wiring that carries these three indicators is shown in Figure 3 and is deliberately minimal: the 16x2 LCD reaches the board over a two-wire I2C link on D2 and D1, the buzzer is driven from D5 as a pulse-width-modulated tone, and the two LEDs sit on D6 and D7 behind 220 ohm resistors. The node keeps showing the last state it received, which is precisely the property that matters when the management network drops during an incident. On the operator side the board watcher mirrors this in software: when a serial device disappears it clears its cached device state, so a later insertion is judged on fresh evidence rather than on a stale allow-list entry.</w:t>
+      </w:r>
+    </w:p>
+    <w:p>
+      <w:pPr>
+        <w:spacing w:before="120" w:after="40"/>
+        <w:jc w:val="center"/>
+      </w:pPr>
+      <w:r>
+        <w:drawing>
+          <wp:inline xmlns:a="http://schemas.openxmlformats.org/drawingml/2006/main" xmlns:pic="http://schemas.openxmlformats.org/drawingml/2006/picture">
+            <wp:extent cx="5669280" cy="4294086"/>
+            <wp:docPr id="3" name="Picture 3"/>
+            <wp:cNvGraphicFramePr>
+              <a:graphicFrameLocks noChangeAspect="1"/>
+            </wp:cNvGraphicFramePr>
+            <a:graphic>
+              <a:graphicData uri="http://schemas.openxmlformats.org/drawingml/2006/picture">
+                <pic:pic>
+                  <pic:nvPicPr>
+                    <pic:cNvPr id="0" name="fig11_circuit.png"/>
+                    <pic:cNvPicPr/>
+                  </pic:nvPicPr>
+                  <pic:blipFill>
+                    <a:blip r:embed="rId11"/>
+                    <a:stretch>
+                      <a:fillRect/>
+                    </a:stretch>
+                  </pic:blipFill>
+                  <pic:spPr>
+                    <a:xfrm>
+                      <a:off x="0" y="0"/>
+                      <a:ext cx="5669280" cy="4294086"/>
+                    </a:xfrm>
+                    <a:prstGeom prst="rect"/>
+                  </pic:spPr>
+                </pic:pic>
+              </a:graphicData>
+            </a:graphic>
+          </wp:inline>
+        </w:drawing>
+      </w:r>
+    </w:p>
+    <w:p>
+      <w:pPr>
+        <w:spacing w:after="200"/>
+        <w:jc w:val="center"/>
+      </w:pPr>
+      <w:r>
+        <w:rPr>
+          <w:rFonts w:ascii="Tahoma" w:hAnsi="Tahoma"/>
+          <w:i/>
+          <w:sz w:val="18"/>
+        </w:rPr>
+        <w:t>Figure 3: Circuit diagram of the edge node. A tampered USB payload blocks server-side, and the safe_fallback command drives the red LED and the buzzer on D5 automatically.</w:t>
       </w:r>
     </w:p>
     <w:p>
@@ -1591,7 +1645,7 @@
           <w:i w:val="0"/>
           <w:sz w:val="22"/>
         </w:rPr>
-        <w:t>Detection on this corpus is therefore three attacks out of three blocked, with one genuine update rendered and no false positive. The number worth staring at is not 71 but the column next to it: all three attacks report the same reason, hash mismatch, which is the fingerprint of the ordering described in Section 3.2. The fusion stage contributed risk points but did not decide anything, and had the forest been unavailable at that moment the three payloads would still have been blocked. Figure 3 plots the risk scores against the frozen thresholds.</w:t>
+        <w:t>Detection on this corpus is therefore three attacks out of three blocked, with one genuine update rendered and no false positive. The number worth staring at is not 71 but the column next to it: all three attacks report the same reason, hash mismatch, which is the fingerprint of the ordering described in Section 3.2. The fusion stage contributed risk points but did not decide anything, and had the forest been unavailable at that moment the three payloads would still have been blocked. Figure 4 plots the risk scores against the frozen thresholds.</w:t>
       </w:r>
     </w:p>
     <w:p>
@@ -1603,7 +1657,7 @@
         <w:drawing>
           <wp:inline xmlns:a="http://schemas.openxmlformats.org/drawingml/2006/main" xmlns:pic="http://schemas.openxmlformats.org/drawingml/2006/picture">
             <wp:extent cx="5486400" cy="2955333"/>
-            <wp:docPr id="3" name="Picture 3"/>
+            <wp:docPr id="4" name="Picture 4"/>
             <wp:cNvGraphicFramePr>
               <a:graphicFrameLocks noChangeAspect="1"/>
             </wp:cNvGraphicFramePr>
@@ -1615,7 +1669,7 @@
                     <pic:cNvPicPr/>
                   </pic:nvPicPr>
                   <pic:blipFill>
-                    <a:blip r:embed="rId11"/>
+                    <a:blip r:embed="rId12"/>
                     <a:stretch>
                       <a:fillRect/>
                     </a:stretch>
@@ -1645,7 +1699,7 @@
           <w:i/>
           <w:sz w:val="18"/>
         </w:rPr>
-        <w:t>Figure 3: Risk score of each scenario measured against the frozen level thresholds. The genuine update sits far below the render threshold of 50; all three attacks sit above it.</w:t>
+        <w:t>Figure 4: Risk score of each scenario measured against the frozen level thresholds. The genuine update sits far below the render threshold of 50; all three attacks sit above it.</w:t>
       </w:r>
     </w:p>
     <w:p>
@@ -1661,7 +1715,7 @@
           <w:i w:val="0"/>
           <w:sz w:val="22"/>
         </w:rPr>
-        <w:t>Latency was the part of the evaluation that taught us something we had not expected. Timing the pipeline in process gave a mean of 21.7 ms for a scenario with a populated event window, of which the SHAP explanation is the dominant term, while a content-only request over keep-alive HTTP measured a median of 3.3 ms. Both are far inside the budget of a display that updates every few seconds. The surprise was the fresh-connection case, which measured a suspiciously constant 2040 ms. Chasing it down showed that the health endpoint was exactly as slow as the analysis endpoint, that a keep-alive request on the same connection took half a millisecond, and that the hostname localhost resolves to the IPv6 address ::1 on this host while the ASGI server binds IPv4 only. Each new connection was therefore waiting about two seconds before falling back. The processing path was never the slow part; an environmental artefact was being attributed to our decision engine. Figure 4 shows both numbers side by side so that the distinction is not lost, and the practical guidance we recorded from it is to address the service by an IPv4 literal or to bind a dual-stack listener.</w:t>
+        <w:t>Latency was the part of the evaluation that taught us something we had not expected. Timing the pipeline in process gave a mean of 21.7 ms for a scenario with a populated event window, of which the SHAP explanation is the dominant term, while a content-only request over keep-alive HTTP measured a median of 3.3 ms. Both are far inside the budget of a display that updates every few seconds. The surprise was the fresh-connection case, which measured a suspiciously constant 2040 ms. Chasing it down showed that the health endpoint was exactly as slow as the analysis endpoint, that a keep-alive request on the same connection took half a millisecond, and that the hostname localhost resolves to the IPv6 address ::1 on this host while the ASGI server binds IPv4 only. Each new connection was therefore waiting about two seconds before falling back. The processing path was never the slow part; an environmental artefact was being attributed to our decision engine. Figure 5 shows both numbers side by side so that the distinction is not lost, and the practical guidance we recorded from it is to address the service by an IPv4 literal or to bind a dual-stack listener.</w:t>
       </w:r>
     </w:p>
     <w:p>
@@ -1673,7 +1727,7 @@
         <w:drawing>
           <wp:inline xmlns:a="http://schemas.openxmlformats.org/drawingml/2006/main" xmlns:pic="http://schemas.openxmlformats.org/drawingml/2006/picture">
             <wp:extent cx="5486400" cy="2953541"/>
-            <wp:docPr id="4" name="Picture 4"/>
+            <wp:docPr id="5" name="Picture 5"/>
             <wp:cNvGraphicFramePr>
               <a:graphicFrameLocks noChangeAspect="1"/>
             </wp:cNvGraphicFramePr>
@@ -1685,7 +1739,7 @@
                     <pic:cNvPicPr/>
                   </pic:nvPicPr>
                   <pic:blipFill>
-                    <a:blip r:embed="rId12"/>
+                    <a:blip r:embed="rId13"/>
                     <a:stretch>
                       <a:fillRect/>
                     </a:stretch>
@@ -1715,7 +1769,7 @@
           <w:i/>
           <w:sz w:val="18"/>
         </w:rPr>
-        <w:t>Figure 4: Measured decision latency. Explainable inference dominates the pipeline, transport is negligible, and the two second bar on the right is the name-resolution artefact discussed above.</w:t>
+        <w:t>Figure 5: Measured decision latency. Explainable inference dominates the pipeline, transport is negligible, and the two second bar on the right is the name-resolution artefact discussed above.</w:t>
       </w:r>
     </w:p>
     <w:p>
@@ -1731,7 +1785,7 @@
           <w:i w:val="0"/>
           <w:sz w:val="22"/>
         </w:rPr>
-        <w:t>The explanations themselves were consistent in a way that we consider the strongest evidence for keeping them inside the decision object. In the baseline it is the staleness of the last authorised update that pushes the assessment up, with an impact of about plus 2.1, while the device trust score and login history pull it down. In all three attacks the dominant factor is the standing device trust score, between plus 3.2 and plus 3.7, followed immediately by the specific hostile signal: unauthorised stick at plus 2.2 for the USB case, wireless anomaly at plus 2.5 for the rogue radio, and failed logins at plus 1.5 for the credential attack. An operator reading the third factor of any verdict can name the behaviour that caused it without opening a notebook, and because the ranking is stable across near-identical inputs there is no reason to learn to ignore it. Figure 5 shows the decomposition for the highest scoring attack.</w:t>
+        <w:t>The explanations themselves were consistent in a way that we consider the strongest evidence for keeping them inside the decision object. In the baseline it is the staleness of the last authorised update that pushes the assessment up, with an impact of about plus 2.1, while the device trust score and login history pull it down. In all three attacks the dominant factor is the standing device trust score, between plus 3.2 and plus 3.7, followed immediately by the specific hostile signal: unauthorised stick at plus 2.2 for the USB case, wireless anomaly at plus 2.5 for the rogue radio, and failed logins at plus 1.5 for the credential attack. An operator reading the third factor of any verdict can name the behaviour that caused it without opening a notebook, and because the ranking is stable across near-identical inputs there is no reason to learn to ignore it. Figure 6 shows the decomposition for the highest scoring attack.</w:t>
       </w:r>
     </w:p>
     <w:p>
@@ -1743,7 +1797,7 @@
         <w:drawing>
           <wp:inline xmlns:a="http://schemas.openxmlformats.org/drawingml/2006/main" xmlns:pic="http://schemas.openxmlformats.org/drawingml/2006/picture">
             <wp:extent cx="5486400" cy="2737363"/>
-            <wp:docPr id="5" name="Picture 5"/>
+            <wp:docPr id="6" name="Picture 6"/>
             <wp:cNvGraphicFramePr>
               <a:graphicFrameLocks noChangeAspect="1"/>
             </wp:cNvGraphicFramePr>
@@ -1755,7 +1809,7 @@
                     <pic:cNvPicPr/>
                   </pic:nvPicPr>
                   <pic:blipFill>
-                    <a:blip r:embed="rId13"/>
+                    <a:blip r:embed="rId14"/>
                     <a:stretch>
                       <a:fillRect/>
                     </a:stretch>
@@ -1785,7 +1839,7 @@
           <w:i/>
           <w:sz w:val="18"/>
         </w:rPr>
-        <w:t>Figure 5: SHAP decomposition of the malicious USB assessment. The contribution of each of the seven features is signed, so the operator sees what raised the score and what held it down.</w:t>
+        <w:t>Figure 6: SHAP decomposition of the malicious USB assessment. The contribution of each of the seven features is signed, so the operator sees what raised the score and what held it down.</w:t>
       </w:r>
     </w:p>
     <w:p>

</xml_diff>